<commit_message>
Lengkapi Dokumen_spesifikasi_input_2.docx pakai data resmi dari repo GLD-V2-Report-2026; tambah referensi bracket & notulen rapat
Isi ~40 field "to be confirmed" dengan data terverifikasi (frekuensi radio, daya, dimensi, mounting, charge controller) dari notulen rapat resmi dan hasil pengujian daya/RF proyek. Field yang benar-benar belum ada datanya sengaja dibiarkan kosong. Tambahkan 3 temuan kritis baru ke analisis kekurangan (sertifikasi ketinggian pemasangan, sertifikasi solar panel & baterai CH, larangan PVC).

Co-Authored-By: Claude Sonnet 5 <noreply@anthropic.com>
</commit_message>
<xml_diff>
--- a/Dokumen_spesifikasi_input_2.docx
+++ b/Dokumen_spesifikasi_input_2.docx
@@ -181,7 +181,7 @@
                 <w:highlight w:val="yellow"/>
                 <w:rtl w:val="0"/>
               </w:rPr>
-              <w:t xml:space="preserve">Battery</w:t>
+              <w:t>Battery (jalur pengembangan terpisah/R&amp;D — TIDAK menghambat deployment; catu daya utama produksi = 24 VDC ≥2A/unit, dec:39)</w:t>
             </w:r>
           </w:p>
         </w:tc>
@@ -227,7 +227,7 @@
                 <w:highlight w:val="yellow"/>
                 <w:rtl w:val="0"/>
               </w:rPr>
-              <w:t xml:space="preserve">220 VAC, 50 Hz [to be confirmed]</w:t>
+              <w:t>220 VAC, 50 Hz (standar jaringan listrik PLN Indonesia)</w:t>
             </w:r>
           </w:p>
         </w:tc>
@@ -319,7 +319,7 @@
                 <w:highlight w:val="yellow"/>
                 <w:rtl w:val="0"/>
               </w:rPr>
-              <w:t xml:space="preserve">[e.g., 5 VDC / 3.3 VDC – to be confirmed]</w:t>
+              <w:t>5 VDC (rail sensor/heater MQ) &amp; 3,3 VDC (logic ESP32-S3) — rincian arus tiap rail internal masih perlu didokumentasikan lebih lanjut</w:t>
             </w:r>
           </w:p>
         </w:tc>
@@ -365,7 +365,7 @@
                 <w:highlight w:val="yellow"/>
                 <w:rtl w:val="0"/>
               </w:rPr>
-              <w:t xml:space="preserve">[to be confirmed] 0,3 A</w:t>
+              <w:t>±0,33 A @ 24 VDC (dihitung dari konsumsi daya maks 7,995 W ÷ 24 VDC, sesuai Parameter spesifikasi EMC_lengkap.docx)</w:t>
             </w:r>
           </w:p>
         </w:tc>
@@ -411,7 +411,7 @@
                 <w:highlight w:val="yellow"/>
                 <w:rtl w:val="0"/>
               </w:rPr>
-              <w:t xml:space="preserve">[to be confirmed] 0,3 x 24 W</w:t>
+              <w:t>7,995 W @ 24 VDC (versi catu daya kontinu final, sesuai Parameter spesifikasi EMC_lengkap.docx &amp; dec:39). Catatan: draw ON versi baterai duty-cycled terukur terpisah 5,75 W (5V×1,15A) — beda mode operasi, bukan kontradiksi.</w:t>
             </w:r>
           </w:p>
         </w:tc>
@@ -457,7 +457,7 @@
                 <w:highlight w:val="yellow"/>
                 <w:rtl w:val="0"/>
               </w:rPr>
-              <w:t xml:space="preserve">[to be confirmed] li-ion 18650</w:t>
+              <w:t>Li-ion 18650, konfigurasi 7P (7 sel paralel) — jalur pengembangan terpisah (R&amp;D), TIDAK menghambat deployment versi 24 VDC (dec:39)</w:t>
             </w:r>
           </w:p>
         </w:tc>
@@ -503,7 +503,7 @@
                 <w:highlight w:val="yellow"/>
                 <w:rtl w:val="0"/>
               </w:rPr>
-              <w:t xml:space="preserve">[to be confirmed] 4.2 V</w:t>
+              <w:t>4,2 V (tegangan penuh/full-charge per sel; tegangan nominal Li-ion pada umumnya 3,7 V — perlu klarifikasi istilah pada dokumen asal)</w:t>
             </w:r>
           </w:p>
         </w:tc>
@@ -549,7 +549,7 @@
                 <w:highlight w:val="yellow"/>
                 <w:rtl w:val="0"/>
               </w:rPr>
-              <w:t xml:space="preserve">[to be confirmed] 28000 mAh</w:t>
+              <w:t>28.000 mAh / 28 Ah total (konfigurasi 7P × 4.000 mAh, ≈70,4 Wh usable) — BUKAN salah ketik, sesuai data pengujian daya (Timeline Update Juli 2026)</w:t>
             </w:r>
           </w:p>
         </w:tc>
@@ -720,7 +720,7 @@
                 <w:highlight w:val="yellow"/>
                 <w:rtl w:val="0"/>
               </w:rPr>
-              <w:t xml:space="preserve">[to be confirmed] mq-8, … .. </w:t>
+              <w:t>MQ-2, MQ-3B, MQ-4, MQ-5, MQ-6, MQ-7B, MQ-8, MQ-135 (8 kanal, sesuai Parameter spesifikasi EMC_lengkap.docx)</w:t>
             </w:r>
           </w:p>
         </w:tc>
@@ -766,7 +766,7 @@
                 <w:highlight w:val="yellow"/>
                 <w:rtl w:val="0"/>
               </w:rPr>
-              <w:t xml:space="preserve">[to be confirmed]</w:t>
+              <w:t>Tidak terpasang pada unit Node Sensor lapangan — BME280 ganda (internal/eksternal) hanya ada pada rig gas chamber R&amp;D terpisah; perlu klarifikasi apakah environmental sensor dimaksud untuk unit produksi</w:t>
             </w:r>
           </w:p>
         </w:tc>
@@ -812,7 +812,7 @@
                 <w:highlight w:val="yellow"/>
                 <w:rtl w:val="0"/>
               </w:rPr>
-              <w:t xml:space="preserve">[Microcontroller type – to be confirmed] </w:t>
+              <w:t>ESP32-S3-WROOM-1U (sesuai Parameter spesifikasi EMC_lengkap.docx)</w:t>
             </w:r>
           </w:p>
         </w:tc>
@@ -904,7 +904,7 @@
                 <w:highlight w:val="yellow"/>
                 <w:rtl w:val="0"/>
               </w:rPr>
-              <w:t xml:space="preserve">[to be confirmed according to configured LoRa band] 920-923 MHz</w:t>
+              <w:t>920 MHz (konfigurasi STAR ke Cluster Head), dalam pita ISM regional 920–923 MHz — sesuai Parameter spesifikasi EMC_lengkap.docx</w:t>
             </w:r>
           </w:p>
         </w:tc>
@@ -950,7 +950,7 @@
                 <w:highlight w:val="yellow"/>
                 <w:rtl w:val="0"/>
               </w:rPr>
-              <w:t xml:space="preserve">[to be confirmed] 17dBm</w:t>
+              <w:t>17 dBm (dikonfigurasi firmware; modul radio E22-900MM22S mampu maksimum 22 dBm — bukan kontradiksi, lihat dec:45)</w:t>
             </w:r>
           </w:p>
         </w:tc>
@@ -996,7 +996,7 @@
                 <w:highlight w:val="yellow"/>
                 <w:rtl w:val="0"/>
               </w:rPr>
-              <w:t xml:space="preserve">[Internal/external, type and gain – to be confirmed] external, SMA Male, 3 dBi</w:t>
+              <w:t>Eksternal, omnidirectional, konektor SMA Male, gain 3 dBi (sesuai Parameter spesifikasi EMC_lengkap.docx)</w:t>
             </w:r>
           </w:p>
         </w:tc>
@@ -1042,7 +1042,7 @@
                 <w:highlight w:val="yellow"/>
                 <w:rtl w:val="0"/>
               </w:rPr>
-              <w:t xml:space="preserve">Configurable [value to be confirmed] 10 s</w:t>
+              <w:t>Configurable, default 10 s (dikonfirmasi sbg asumsi pengujian daya baterai Cluster Head)</w:t>
             </w:r>
           </w:p>
         </w:tc>
@@ -1165,7 +1165,7 @@
                 <w:highlight w:val="yellow"/>
                 <w:rtl w:val="0"/>
               </w:rPr>
-              <w:t xml:space="preserve">[to be confirmed]</w:t>
+              <w:t>Metal (sesuai Parameter spesifikasi EMC_lengkap.docx) — jenis/grade logam spesifik belum ditentukan; PVC dihindari untuk seluruh housing/bracket sesuai keputusan rapat 6 Agustus 2026 (dec:31)</w:t>
             </w:r>
           </w:p>
         </w:tc>
@@ -1211,7 +1211,7 @@
                 <w:highlight w:val="yellow"/>
                 <w:rtl w:val="0"/>
               </w:rPr>
-              <w:t xml:space="preserve">[to be confirmed] mm</w:t>
+              <w:t>200 × 90 × 290 mm (20×9×29 cm, sesuai Parameter spesifikasi EMC_lengkap.docx)</w:t>
             </w:r>
           </w:p>
         </w:tc>
@@ -1303,7 +1303,7 @@
                 <w:highlight w:val="yellow"/>
                 <w:rtl w:val="0"/>
               </w:rPr>
-              <w:t xml:space="preserve">[Wall/pole/structure mounting – to be confirmed]</w:t>
+              <w:t>L-bracket, referensi desain sistem Corrosion Monitoring Emerson, dipasang ke struktur existing kilang tanpa pengeboran/pengelasan (dec:27, dec:40)</w:t>
             </w:r>
           </w:p>
         </w:tc>
@@ -1441,7 +1441,7 @@
                 <w:highlight w:val="yellow"/>
                 <w:rtl w:val="0"/>
               </w:rPr>
-              <w:t xml:space="preserve">[External/internal – to be confirmed] external</w:t>
+              <w:t>Eksternal (konektor SMA Male). Catatan: pada beberapa unit, antena Wi-Fi 2,4G masih di dalam casing dan perlu dikeluarkan agar konfigurasi channel berfungsi andal (temuan weekly meeting 30 Jul 2026)</w:t>
             </w:r>
           </w:p>
         </w:tc>
@@ -1766,7 +1766,7 @@
                 <w:highlight w:val="yellow"/>
                 <w:rtl w:val="0"/>
               </w:rPr>
-              <w:t xml:space="preserve">[Li-ion/LiFePO₄/etc. – to be confirmed] Li-ion</w:t>
+              <w:t>Li-ion 18650 (sel sama dengan Node Sensor) — keamanan sel/BMS di kondisi kilang BELUM didokumentasikan (gate:ch-batt-safety, dec:41)</w:t>
             </w:r>
           </w:p>
         </w:tc>
@@ -1812,7 +1812,7 @@
                 <w:highlight w:val="yellow"/>
                 <w:rtl w:val="0"/>
               </w:rPr>
-              <w:t xml:space="preserve">[to be confirmed] 4.2 VDC</w:t>
+              <w:t>4,2 V (tegangan penuh/full-charge; tegangan nominal Li-ion pada umumnya 3,7 V — perlu klarifikasi istilah)</w:t>
             </w:r>
           </w:p>
         </w:tc>
@@ -1904,7 +1904,7 @@
                 <w:highlight w:val="yellow"/>
                 <w:rtl w:val="0"/>
               </w:rPr>
-              <w:t xml:space="preserve">[to be confirmed] Wp</w:t>
+              <w:t>±6,51 Wp per panel (Isc 1,29 A); 2 panel terpasang per Cluster Head menghasilkan surplus energi 1,5–4,4 Wh/hari dibanding kebutuhan ≈7,56 Wh/hari (data Timeline Update Juli 2026)</w:t>
             </w:r>
           </w:p>
         </w:tc>
@@ -1950,7 +1950,7 @@
                 <w:highlight w:val="yellow"/>
                 <w:rtl w:val="0"/>
               </w:rPr>
-              <w:t xml:space="preserve">[to be confirmed] V</w:t>
+              <w:t>≈7,77 V (titik operasi terukur panel, arus 0,74 A)</w:t>
             </w:r>
           </w:p>
         </w:tc>
@@ -1996,7 +1996,7 @@
                 <w:highlight w:val="yellow"/>
                 <w:rtl w:val="0"/>
               </w:rPr>
-              <w:t xml:space="preserve">[to be confirmed]</w:t>
+              <w:t>BQ25185 (Texas Instruments) — IC charger + power path management solar/baterai</w:t>
             </w:r>
           </w:p>
         </w:tc>
@@ -2042,7 +2042,7 @@
                 <w:highlight w:val="yellow"/>
                 <w:rtl w:val="0"/>
               </w:rPr>
-              <w:t xml:space="preserve">[to be confirmed] VDC</w:t>
+              <w:t>3,3 VDC (via regulator buck-boost TPS63020)</w:t>
             </w:r>
           </w:p>
         </w:tc>
@@ -2134,7 +2134,7 @@
                 <w:highlight w:val="yellow"/>
                 <w:rtl w:val="0"/>
               </w:rPr>
-              <w:t xml:space="preserve">[to be confirmed] W</w:t>
+              <w:t>0,73 W (sesuai Parameter spesifikasi EMC_lengkap.docx). Catatan: konsumsi rata-rata terukur di lapangan ≈84 mA (≈7,56 Wh/hari) — basis pengukuran (maks vs rata-rata operasional) berbeda, belum direkonsiliasi formal (gate:ch-power-spec)</w:t>
             </w:r>
           </w:p>
         </w:tc>
@@ -2180,7 +2180,7 @@
                 <w:highlight w:val="yellow"/>
                 <w:rtl w:val="0"/>
               </w:rPr>
-              <w:t xml:space="preserve">[Overcharge/over-discharge/short-circuit/reverse polarity – to be confirmed]</w:t>
+              <w:t>Sebagian ditangani IC charger BQ25185 (proteksi pengisian baterai standar) — rincian proteksi sirkuit lengkap (short-circuit/reverse polarity) belum didokumentasikan</w:t>
             </w:r>
           </w:p>
         </w:tc>
@@ -2305,7 +2305,7 @@
                 <w:highlight w:val="yellow"/>
                 <w:rtl w:val="0"/>
               </w:rPr>
-              <w:t xml:space="preserve">[LoRa / other – to be confirmed]</w:t>
+              <w:t>LoRa (topologi STAR, Node Sensor → Cluster Head)</w:t>
             </w:r>
           </w:p>
         </w:tc>
@@ -2351,7 +2351,7 @@
                 <w:highlight w:val="yellow"/>
                 <w:rtl w:val="0"/>
               </w:rPr>
-              <w:t xml:space="preserve">LoRa [to be confirmed]</w:t>
+              <w:t>LoRa (topologi MESH multi-hop, antar-Cluster Head → Gateway)</w:t>
             </w:r>
           </w:p>
         </w:tc>
@@ -2397,7 +2397,7 @@
                 <w:highlight w:val="yellow"/>
                 <w:rtl w:val="0"/>
               </w:rPr>
-              <w:t xml:space="preserve">[to be confirmed] MHz</w:t>
+              <w:t>920 MHz (STAR, ke Node Sensor) / 921 MHz (MESH, antar-CH ke Gateway) — sesuai Parameter spesifikasi EMC_lengkap.docx</w:t>
             </w:r>
           </w:p>
         </w:tc>
@@ -2443,7 +2443,7 @@
                 <w:highlight w:val="yellow"/>
                 <w:rtl w:val="0"/>
               </w:rPr>
-              <w:t xml:space="preserve">[to be confirmed] dBm</w:t>
+              <w:t>22 dBm (maksimum modul radio E22-900MM22S, sesuai Parameter spesifikasi EMC_lengkap.docx)</w:t>
             </w:r>
           </w:p>
         </w:tc>
@@ -2489,7 +2489,7 @@
                 <w:highlight w:val="yellow"/>
                 <w:rtl w:val="0"/>
               </w:rPr>
-              <w:t xml:space="preserve">[to be confirmed]</w:t>
+              <w:t>Fiber omnidirectional (sesuai Parameter spesifikasi EMC_lengkap.docx)</w:t>
             </w:r>
           </w:p>
         </w:tc>
@@ -2535,7 +2535,7 @@
                 <w:highlight w:val="yellow"/>
                 <w:rtl w:val="0"/>
               </w:rPr>
-              <w:t xml:space="preserve">[to be confirmed] dBi</w:t>
+              <w:t>3 dBi (STAR, ke Node Sensor) / 8 dBi (MESH, antar-CH) — sesuai Parameter spesifikasi EMC_lengkap.docx</w:t>
             </w:r>
           </w:p>
         </w:tc>
@@ -2581,7 +2581,7 @@
                 <w:highlight w:val="yellow"/>
                 <w:rtl w:val="0"/>
               </w:rPr>
-              <w:t xml:space="preserve">Installation/environment dependent</w:t>
+              <w:t>Installation/environment dependent — referensi pengujian lapangan: ~100 m @ −71 dBm (PDR 100%), hingga 242 m PDR 100% (area terbuka), turun ke PDR 26% pada −112 dBm (data uji RF LoRa internal)</w:t>
             </w:r>
           </w:p>
         </w:tc>
@@ -2627,7 +2627,7 @@
                 <w:highlight w:val="yellow"/>
                 <w:rtl w:val="0"/>
               </w:rPr>
-              <w:t xml:space="preserve">[to be confirmed]</w:t>
+              <w:t>Belum ada angka resmi — action item terbuka (Tim Komunikasi ITB, gate:capacity); jangan kutip angka spesifik sebelum dikonfirmasi resmi</w:t>
             </w:r>
           </w:p>
         </w:tc>
@@ -2798,6 +2798,236 @@
                 <w:highlight w:val="yellow"/>
                 <w:rtl w:val="0"/>
               </w:rPr>
+              <w:t>Metal (sesuai Parameter spesifikasi EMC_lengkap.docx); PVC dihindari sesuai keputusan rapat 6 Agustus 2026 (dec:31)</w:t>
+            </w:r>
+          </w:p>
+        </w:tc>
+      </w:tr>
+      <w:tr>
+        <w:trPr>
+          <w:cantSplit w:val="0"/>
+          <w:tblHeader w:val="0"/>
+        </w:trPr>
+        <w:tc>
+          <w:tcPr>
+            <w:vAlign w:val="center"/>
+          </w:tcPr>
+          <w:p>
+            <w:pPr>
+              <w:rPr>
+                <w:rFonts w:ascii="Times New Roman" w:cs="Times New Roman" w:eastAsia="Times New Roman" w:hAnsi="Times New Roman"/>
+              </w:rPr>
+            </w:pPr>
+            <w:r>
+              <w:rPr>
+                <w:rFonts w:ascii="Times New Roman" w:cs="Times New Roman" w:eastAsia="Times New Roman" w:hAnsi="Times New Roman"/>
+                <w:rtl w:val="0"/>
+              </w:rPr>
+              <w:t xml:space="preserve">Dimensions (L × W × H)</w:t>
+            </w:r>
+          </w:p>
+        </w:tc>
+        <w:tc>
+          <w:tcPr>
+            <w:vAlign w:val="center"/>
+          </w:tcPr>
+          <w:p>
+            <w:pPr>
+              <w:rPr>
+                <w:rFonts w:ascii="Times New Roman" w:cs="Times New Roman" w:eastAsia="Times New Roman" w:hAnsi="Times New Roman"/>
+                <w:highlight w:val="yellow"/>
+              </w:rPr>
+            </w:pPr>
+            <w:r>
+              <w:rPr>
+                <w:rFonts w:ascii="Times New Roman" w:cs="Times New Roman" w:eastAsia="Times New Roman" w:hAnsi="Times New Roman"/>
+                <w:highlight w:val="yellow"/>
+                <w:rtl w:val="0"/>
+              </w:rPr>
+              <w:t>80 × 80 × 210 mm (8×8×21 cm, sesuai Parameter spesifikasi EMC_lengkap.docx)</w:t>
+            </w:r>
+          </w:p>
+        </w:tc>
+      </w:tr>
+      <w:tr>
+        <w:trPr>
+          <w:cantSplit w:val="0"/>
+          <w:tblHeader w:val="0"/>
+        </w:trPr>
+        <w:tc>
+          <w:tcPr>
+            <w:vAlign w:val="center"/>
+          </w:tcPr>
+          <w:p>
+            <w:pPr>
+              <w:rPr>
+                <w:rFonts w:ascii="Times New Roman" w:cs="Times New Roman" w:eastAsia="Times New Roman" w:hAnsi="Times New Roman"/>
+              </w:rPr>
+            </w:pPr>
+            <w:r>
+              <w:rPr>
+                <w:rFonts w:ascii="Times New Roman" w:cs="Times New Roman" w:eastAsia="Times New Roman" w:hAnsi="Times New Roman"/>
+                <w:rtl w:val="0"/>
+              </w:rPr>
+              <w:t xml:space="preserve">Weight</w:t>
+            </w:r>
+          </w:p>
+        </w:tc>
+        <w:tc>
+          <w:tcPr>
+            <w:vAlign w:val="center"/>
+          </w:tcPr>
+          <w:p>
+            <w:pPr>
+              <w:rPr>
+                <w:rFonts w:ascii="Times New Roman" w:cs="Times New Roman" w:eastAsia="Times New Roman" w:hAnsi="Times New Roman"/>
+                <w:highlight w:val="yellow"/>
+              </w:rPr>
+            </w:pPr>
+            <w:r>
+              <w:rPr>
+                <w:rFonts w:ascii="Times New Roman" w:cs="Times New Roman" w:eastAsia="Times New Roman" w:hAnsi="Times New Roman"/>
+                <w:highlight w:val="yellow"/>
+                <w:rtl w:val="0"/>
+              </w:rPr>
+              <w:t xml:space="preserve">[to be confirmed] kg</w:t>
+            </w:r>
+          </w:p>
+        </w:tc>
+      </w:tr>
+      <w:tr>
+        <w:trPr>
+          <w:cantSplit w:val="0"/>
+          <w:tblHeader w:val="0"/>
+        </w:trPr>
+        <w:tc>
+          <w:tcPr>
+            <w:vAlign w:val="center"/>
+          </w:tcPr>
+          <w:p>
+            <w:pPr>
+              <w:rPr>
+                <w:rFonts w:ascii="Times New Roman" w:cs="Times New Roman" w:eastAsia="Times New Roman" w:hAnsi="Times New Roman"/>
+              </w:rPr>
+            </w:pPr>
+            <w:r>
+              <w:rPr>
+                <w:rFonts w:ascii="Times New Roman" w:cs="Times New Roman" w:eastAsia="Times New Roman" w:hAnsi="Times New Roman"/>
+                <w:rtl w:val="0"/>
+              </w:rPr>
+              <w:t xml:space="preserve">Mounting method</w:t>
+            </w:r>
+          </w:p>
+        </w:tc>
+        <w:tc>
+          <w:tcPr>
+            <w:vAlign w:val="center"/>
+          </w:tcPr>
+          <w:p>
+            <w:pPr>
+              <w:rPr>
+                <w:rFonts w:ascii="Times New Roman" w:cs="Times New Roman" w:eastAsia="Times New Roman" w:hAnsi="Times New Roman"/>
+                <w:highlight w:val="yellow"/>
+              </w:rPr>
+            </w:pPr>
+            <w:r>
+              <w:rPr>
+                <w:rFonts w:ascii="Times New Roman" w:cs="Times New Roman" w:eastAsia="Times New Roman" w:hAnsi="Times New Roman"/>
+                <w:highlight w:val="yellow"/>
+                <w:rtl w:val="0"/>
+              </w:rPr>
+              <w:t>L-bracket, referensi desain Emerson, dipasang satu tiang bersama panel solar (dec:40)</w:t>
+            </w:r>
+          </w:p>
+        </w:tc>
+      </w:tr>
+      <w:tr>
+        <w:trPr>
+          <w:cantSplit w:val="0"/>
+          <w:tblHeader w:val="0"/>
+        </w:trPr>
+        <w:tc>
+          <w:tcPr>
+            <w:vAlign w:val="center"/>
+          </w:tcPr>
+          <w:p>
+            <w:pPr>
+              <w:rPr>
+                <w:rFonts w:ascii="Times New Roman" w:cs="Times New Roman" w:eastAsia="Times New Roman" w:hAnsi="Times New Roman"/>
+              </w:rPr>
+            </w:pPr>
+            <w:r>
+              <w:rPr>
+                <w:rFonts w:ascii="Times New Roman" w:cs="Times New Roman" w:eastAsia="Times New Roman" w:hAnsi="Times New Roman"/>
+                <w:rtl w:val="0"/>
+              </w:rPr>
+              <w:t xml:space="preserve">Ingress protection</w:t>
+            </w:r>
+          </w:p>
+        </w:tc>
+        <w:tc>
+          <w:tcPr>
+            <w:vAlign w:val="center"/>
+          </w:tcPr>
+          <w:p>
+            <w:pPr>
+              <w:rPr>
+                <w:rFonts w:ascii="Times New Roman" w:cs="Times New Roman" w:eastAsia="Times New Roman" w:hAnsi="Times New Roman"/>
+                <w:highlight w:val="yellow"/>
+              </w:rPr>
+            </w:pPr>
+            <w:r>
+              <w:rPr>
+                <w:rFonts w:ascii="Times New Roman" w:cs="Times New Roman" w:eastAsia="Times New Roman" w:hAnsi="Times New Roman"/>
+                <w:highlight w:val="yellow"/>
+                <w:rtl w:val="0"/>
+              </w:rPr>
+              <w:t>IP66/67 (dikonfirmasi pada dokumentasi internal proyek)</w:t>
+            </w:r>
+          </w:p>
+        </w:tc>
+      </w:tr>
+      <w:tr>
+        <w:trPr>
+          <w:cantSplit w:val="0"/>
+          <w:tblHeader w:val="0"/>
+        </w:trPr>
+        <w:tc>
+          <w:tcPr>
+            <w:vAlign w:val="center"/>
+          </w:tcPr>
+          <w:p>
+            <w:pPr>
+              <w:rPr>
+                <w:rFonts w:ascii="Times New Roman" w:cs="Times New Roman" w:eastAsia="Times New Roman" w:hAnsi="Times New Roman"/>
+              </w:rPr>
+            </w:pPr>
+            <w:r>
+              <w:rPr>
+                <w:rFonts w:ascii="Times New Roman" w:cs="Times New Roman" w:eastAsia="Times New Roman" w:hAnsi="Times New Roman"/>
+                <w:rtl w:val="0"/>
+              </w:rPr>
+              <w:t xml:space="preserve">Cable entry</w:t>
+            </w:r>
+          </w:p>
+        </w:tc>
+        <w:tc>
+          <w:tcPr>
+            <w:vAlign w:val="center"/>
+          </w:tcPr>
+          <w:p>
+            <w:pPr>
+              <w:rPr>
+                <w:rFonts w:ascii="Times New Roman" w:cs="Times New Roman" w:eastAsia="Times New Roman" w:hAnsi="Times New Roman"/>
+                <w:highlight w:val="yellow"/>
+              </w:rPr>
+            </w:pPr>
+            <w:r>
+              <w:rPr>
+                <w:rFonts w:ascii="Times New Roman" w:cs="Times New Roman" w:eastAsia="Times New Roman" w:hAnsi="Times New Roman"/>
+                <w:highlight w:val="yellow"/>
+                <w:rtl w:val="0"/>
+              </w:rPr>
               <w:t xml:space="preserve">[to be confirmed]</w:t>
             </w:r>
           </w:p>
@@ -2823,191 +3053,7 @@
                 <w:rFonts w:ascii="Times New Roman" w:cs="Times New Roman" w:eastAsia="Times New Roman" w:hAnsi="Times New Roman"/>
                 <w:rtl w:val="0"/>
               </w:rPr>
-              <w:t xml:space="preserve">Dimensions (L × W × H)</w:t>
-            </w:r>
-          </w:p>
-        </w:tc>
-        <w:tc>
-          <w:tcPr>
-            <w:vAlign w:val="center"/>
-          </w:tcPr>
-          <w:p>
-            <w:pPr>
-              <w:rPr>
-                <w:rFonts w:ascii="Times New Roman" w:cs="Times New Roman" w:eastAsia="Times New Roman" w:hAnsi="Times New Roman"/>
-                <w:highlight w:val="yellow"/>
-              </w:rPr>
-            </w:pPr>
-            <w:r>
-              <w:rPr>
-                <w:rFonts w:ascii="Times New Roman" w:cs="Times New Roman" w:eastAsia="Times New Roman" w:hAnsi="Times New Roman"/>
-                <w:highlight w:val="yellow"/>
-                <w:rtl w:val="0"/>
-              </w:rPr>
-              <w:t xml:space="preserve">[to be confirmed] mm</w:t>
-            </w:r>
-          </w:p>
-        </w:tc>
-      </w:tr>
-      <w:tr>
-        <w:trPr>
-          <w:cantSplit w:val="0"/>
-          <w:tblHeader w:val="0"/>
-        </w:trPr>
-        <w:tc>
-          <w:tcPr>
-            <w:vAlign w:val="center"/>
-          </w:tcPr>
-          <w:p>
-            <w:pPr>
-              <w:rPr>
-                <w:rFonts w:ascii="Times New Roman" w:cs="Times New Roman" w:eastAsia="Times New Roman" w:hAnsi="Times New Roman"/>
-              </w:rPr>
-            </w:pPr>
-            <w:r>
-              <w:rPr>
-                <w:rFonts w:ascii="Times New Roman" w:cs="Times New Roman" w:eastAsia="Times New Roman" w:hAnsi="Times New Roman"/>
-                <w:rtl w:val="0"/>
-              </w:rPr>
-              <w:t xml:space="preserve">Weight</w:t>
-            </w:r>
-          </w:p>
-        </w:tc>
-        <w:tc>
-          <w:tcPr>
-            <w:vAlign w:val="center"/>
-          </w:tcPr>
-          <w:p>
-            <w:pPr>
-              <w:rPr>
-                <w:rFonts w:ascii="Times New Roman" w:cs="Times New Roman" w:eastAsia="Times New Roman" w:hAnsi="Times New Roman"/>
-                <w:highlight w:val="yellow"/>
-              </w:rPr>
-            </w:pPr>
-            <w:r>
-              <w:rPr>
-                <w:rFonts w:ascii="Times New Roman" w:cs="Times New Roman" w:eastAsia="Times New Roman" w:hAnsi="Times New Roman"/>
-                <w:highlight w:val="yellow"/>
-                <w:rtl w:val="0"/>
-              </w:rPr>
-              <w:t xml:space="preserve">[to be confirmed] kg</w:t>
-            </w:r>
-          </w:p>
-        </w:tc>
-      </w:tr>
-      <w:tr>
-        <w:trPr>
-          <w:cantSplit w:val="0"/>
-          <w:tblHeader w:val="0"/>
-        </w:trPr>
-        <w:tc>
-          <w:tcPr>
-            <w:vAlign w:val="center"/>
-          </w:tcPr>
-          <w:p>
-            <w:pPr>
-              <w:rPr>
-                <w:rFonts w:ascii="Times New Roman" w:cs="Times New Roman" w:eastAsia="Times New Roman" w:hAnsi="Times New Roman"/>
-              </w:rPr>
-            </w:pPr>
-            <w:r>
-              <w:rPr>
-                <w:rFonts w:ascii="Times New Roman" w:cs="Times New Roman" w:eastAsia="Times New Roman" w:hAnsi="Times New Roman"/>
-                <w:rtl w:val="0"/>
-              </w:rPr>
-              <w:t xml:space="preserve">Mounting method</w:t>
-            </w:r>
-          </w:p>
-        </w:tc>
-        <w:tc>
-          <w:tcPr>
-            <w:vAlign w:val="center"/>
-          </w:tcPr>
-          <w:p>
-            <w:pPr>
-              <w:rPr>
-                <w:rFonts w:ascii="Times New Roman" w:cs="Times New Roman" w:eastAsia="Times New Roman" w:hAnsi="Times New Roman"/>
-                <w:highlight w:val="yellow"/>
-              </w:rPr>
-            </w:pPr>
-            <w:r>
-              <w:rPr>
-                <w:rFonts w:ascii="Times New Roman" w:cs="Times New Roman" w:eastAsia="Times New Roman" w:hAnsi="Times New Roman"/>
-                <w:highlight w:val="yellow"/>
-                <w:rtl w:val="0"/>
-              </w:rPr>
-              <w:t xml:space="preserve">[Pole/wall/structure mounting – to be confirmed]</w:t>
-            </w:r>
-          </w:p>
-        </w:tc>
-      </w:tr>
-      <w:tr>
-        <w:trPr>
-          <w:cantSplit w:val="0"/>
-          <w:tblHeader w:val="0"/>
-        </w:trPr>
-        <w:tc>
-          <w:tcPr>
-            <w:vAlign w:val="center"/>
-          </w:tcPr>
-          <w:p>
-            <w:pPr>
-              <w:rPr>
-                <w:rFonts w:ascii="Times New Roman" w:cs="Times New Roman" w:eastAsia="Times New Roman" w:hAnsi="Times New Roman"/>
-              </w:rPr>
-            </w:pPr>
-            <w:r>
-              <w:rPr>
-                <w:rFonts w:ascii="Times New Roman" w:cs="Times New Roman" w:eastAsia="Times New Roman" w:hAnsi="Times New Roman"/>
-                <w:rtl w:val="0"/>
-              </w:rPr>
-              <w:t xml:space="preserve">Ingress protection</w:t>
-            </w:r>
-          </w:p>
-        </w:tc>
-        <w:tc>
-          <w:tcPr>
-            <w:vAlign w:val="center"/>
-          </w:tcPr>
-          <w:p>
-            <w:pPr>
-              <w:rPr>
-                <w:rFonts w:ascii="Times New Roman" w:cs="Times New Roman" w:eastAsia="Times New Roman" w:hAnsi="Times New Roman"/>
-                <w:highlight w:val="yellow"/>
-              </w:rPr>
-            </w:pPr>
-            <w:r>
-              <w:rPr>
-                <w:rFonts w:ascii="Times New Roman" w:cs="Times New Roman" w:eastAsia="Times New Roman" w:hAnsi="Times New Roman"/>
-                <w:highlight w:val="yellow"/>
-                <w:rtl w:val="0"/>
-              </w:rPr>
-              <w:t xml:space="preserve">[IP rating – to be confirmed]</w:t>
-            </w:r>
-          </w:p>
-        </w:tc>
-      </w:tr>
-      <w:tr>
-        <w:trPr>
-          <w:cantSplit w:val="0"/>
-          <w:tblHeader w:val="0"/>
-        </w:trPr>
-        <w:tc>
-          <w:tcPr>
-            <w:vAlign w:val="center"/>
-          </w:tcPr>
-          <w:p>
-            <w:pPr>
-              <w:rPr>
-                <w:rFonts w:ascii="Times New Roman" w:cs="Times New Roman" w:eastAsia="Times New Roman" w:hAnsi="Times New Roman"/>
-              </w:rPr>
-            </w:pPr>
-            <w:r>
-              <w:rPr>
-                <w:rFonts w:ascii="Times New Roman" w:cs="Times New Roman" w:eastAsia="Times New Roman" w:hAnsi="Times New Roman"/>
-                <w:rtl w:val="0"/>
-              </w:rPr>
-              <w:t xml:space="preserve">Cable entry</w:t>
+              <w:t xml:space="preserve">Antenna mounting</w:t>
             </w:r>
           </w:p>
         </w:tc>
@@ -3053,52 +3099,6 @@
                 <w:rFonts w:ascii="Times New Roman" w:cs="Times New Roman" w:eastAsia="Times New Roman" w:hAnsi="Times New Roman"/>
                 <w:rtl w:val="0"/>
               </w:rPr>
-              <w:t xml:space="preserve">Antenna mounting</w:t>
-            </w:r>
-          </w:p>
-        </w:tc>
-        <w:tc>
-          <w:tcPr>
-            <w:vAlign w:val="center"/>
-          </w:tcPr>
-          <w:p>
-            <w:pPr>
-              <w:rPr>
-                <w:rFonts w:ascii="Times New Roman" w:cs="Times New Roman" w:eastAsia="Times New Roman" w:hAnsi="Times New Roman"/>
-                <w:highlight w:val="yellow"/>
-              </w:rPr>
-            </w:pPr>
-            <w:r>
-              <w:rPr>
-                <w:rFonts w:ascii="Times New Roman" w:cs="Times New Roman" w:eastAsia="Times New Roman" w:hAnsi="Times New Roman"/>
-                <w:highlight w:val="yellow"/>
-                <w:rtl w:val="0"/>
-              </w:rPr>
-              <w:t xml:space="preserve">[to be confirmed]</w:t>
-            </w:r>
-          </w:p>
-        </w:tc>
-      </w:tr>
-      <w:tr>
-        <w:trPr>
-          <w:cantSplit w:val="0"/>
-          <w:tblHeader w:val="0"/>
-        </w:trPr>
-        <w:tc>
-          <w:tcPr>
-            <w:vAlign w:val="center"/>
-          </w:tcPr>
-          <w:p>
-            <w:pPr>
-              <w:rPr>
-                <w:rFonts w:ascii="Times New Roman" w:cs="Times New Roman" w:eastAsia="Times New Roman" w:hAnsi="Times New Roman"/>
-              </w:rPr>
-            </w:pPr>
-            <w:r>
-              <w:rPr>
-                <w:rFonts w:ascii="Times New Roman" w:cs="Times New Roman" w:eastAsia="Times New Roman" w:hAnsi="Times New Roman"/>
-                <w:rtl w:val="0"/>
-              </w:rPr>
               <w:t xml:space="preserve">Solar panel mounting</w:t>
             </w:r>
           </w:p>
@@ -3120,7 +3120,7 @@
                 <w:highlight w:val="yellow"/>
                 <w:rtl w:val="0"/>
               </w:rPr>
-              <w:t xml:space="preserve">External mounting structure</w:t>
+              <w:t>External mounting structure (tiang ±6 m)</w:t>
             </w:r>
           </w:p>
         </w:tc>
@@ -3445,7 +3445,7 @@
                 <w:highlight w:val="yellow"/>
                 <w:rtl w:val="0"/>
               </w:rPr>
-              <w:t xml:space="preserve">220 VAC, 50 Hz [to be confirmed]</w:t>
+              <w:t>220 VAC, 50 Hz (standar jaringan listrik PLN Indonesia)</w:t>
             </w:r>
           </w:p>
         </w:tc>
@@ -3537,7 +3537,7 @@
                 <w:highlight w:val="yellow"/>
                 <w:rtl w:val="0"/>
               </w:rPr>
-              <w:t xml:space="preserve">[to be confirmed] A</w:t>
+              <w:t>≈0,146 A (dihitung dari konsumsi daya maks 0,73 W ÷ 5 VDC, sesuai Parameter spesifikasi EMC_lengkap.docx)</w:t>
             </w:r>
           </w:p>
         </w:tc>
@@ -3583,7 +3583,7 @@
                 <w:highlight w:val="yellow"/>
                 <w:rtl w:val="0"/>
               </w:rPr>
-              <w:t xml:space="preserve">[to be confirmed] W</w:t>
+              <w:t>0,73 W (sesuai Parameter spesifikasi EMC_lengkap.docx)</w:t>
             </w:r>
           </w:p>
         </w:tc>
@@ -3846,7 +3846,7 @@
                 <w:highlight w:val="yellow"/>
                 <w:rtl w:val="0"/>
               </w:rPr>
-              <w:t xml:space="preserve">[to be confirmed] MHz</w:t>
+              <w:t>921 MHz (sesuai Parameter spesifikasi EMC_lengkap.docx)</w:t>
             </w:r>
           </w:p>
         </w:tc>
@@ -3892,7 +3892,7 @@
                 <w:highlight w:val="yellow"/>
                 <w:rtl w:val="0"/>
               </w:rPr>
-              <w:t xml:space="preserve">[to be confirmed] dBm</w:t>
+              <w:t>22 dBm (maksimum modul radio E22-900MM22S, sesuai Parameter spesifikasi EMC_lengkap.docx)</w:t>
             </w:r>
           </w:p>
         </w:tc>
@@ -3938,7 +3938,7 @@
                 <w:highlight w:val="yellow"/>
                 <w:rtl w:val="0"/>
               </w:rPr>
-              <w:t xml:space="preserve">[to be confirmed]</w:t>
+              <w:t>Fiber omnidirectional (sesuai Parameter spesifikasi EMC_lengkap.docx)</w:t>
             </w:r>
           </w:p>
         </w:tc>
@@ -3984,7 +3984,7 @@
                 <w:highlight w:val="yellow"/>
                 <w:rtl w:val="0"/>
               </w:rPr>
-              <w:t xml:space="preserve">[to be confirmed] dBi</w:t>
+              <w:t>8 dBi (sesuai Parameter spesifikasi EMC_lengkap.docx)</w:t>
             </w:r>
           </w:p>
         </w:tc>
@@ -4030,7 +4030,7 @@
                 <w:highlight w:val="yellow"/>
                 <w:rtl w:val="0"/>
               </w:rPr>
-              <w:t xml:space="preserve">[Ethernet/Wi-Fi/4G/etc. – to be confirmed]</w:t>
+              <w:t>Port Ethernet tersedia secara fisik (sesuai spek EMC) dan/atau Wi-Fi; dukungan firmware Gateway thd jalur Ethernet BELUM dikonfirmasi (gate:gw-ethernet). Gateway wajib terdaftar di jaringan intranet kilang (MAC address, DHCP reservation/IP statis — dec:42)</w:t>
             </w:r>
           </w:p>
         </w:tc>
@@ -4076,7 +4076,7 @@
                 <w:highlight w:val="yellow"/>
                 <w:rtl w:val="0"/>
               </w:rPr>
-              <w:t xml:space="preserve">[to be confirmed]</w:t>
+              <w:t>Tersedia secara fisik pada hardware Gateway (Parameter spesifikasi EMC_lengkap.docx); dukungan firmware belum dikonfirmasi (gate:gw-ethernet)</w:t>
             </w:r>
           </w:p>
         </w:tc>
@@ -4122,7 +4122,7 @@
                 <w:highlight w:val="yellow"/>
                 <w:rtl w:val="0"/>
               </w:rPr>
-              <w:t xml:space="preserve">[to be confirmed]</w:t>
+              <w:t>Kemungkinan tersedia untuk uplink Gateway — catatan dec:23 ("Wi-Fi hanya untuk konfigurasi lokal") ditujukan pada Node Sensor; peran Wi-Fi pada Gateway belum eksplisit dikonfirmasi terpisah</w:t>
             </w:r>
           </w:p>
         </w:tc>
@@ -4168,7 +4168,7 @@
                 <w:highlight w:val="yellow"/>
                 <w:rtl w:val="0"/>
               </w:rPr>
-              <w:t xml:space="preserve">[if applicable]</w:t>
+              <w:t>Disebutkan sbg opsi uplink pada dokumentasi arsitektur (WiFi/4G); implementasi 4G aktual pada unit Gateway saat ini belum dikonfirmasi terpasang</w:t>
             </w:r>
           </w:p>
         </w:tc>
@@ -4214,7 +4214,7 @@
                 <w:highlight w:val="yellow"/>
                 <w:rtl w:val="0"/>
               </w:rPr>
-              <w:t xml:space="preserve">[MQTT/HTTP/TCP-IP/etc. – to be confirmed]</w:t>
+              <w:t>MQTT — kontrak topik &amp; keamanan dijelaskan pada dokumen internal proyek (masih berstatus draft, belum ada bukti broker/deployment live)</w:t>
             </w:r>
           </w:p>
         </w:tc>
@@ -4339,7 +4339,7 @@
                 <w:highlight w:val="yellow"/>
                 <w:rtl w:val="0"/>
               </w:rPr>
-              <w:t xml:space="preserve">[to be confirmed]</w:t>
+              <w:t>Metal (housing sama dengan Cluster Head, sesuai Parameter spesifikasi EMC_lengkap.docx)</w:t>
             </w:r>
           </w:p>
         </w:tc>
@@ -4385,7 +4385,7 @@
                 <w:highlight w:val="yellow"/>
                 <w:rtl w:val="0"/>
               </w:rPr>
-              <w:t xml:space="preserve">[to be confirmed] mm</w:t>
+              <w:t>80 × 80 × 210 mm (8×8×21 cm — housing sama dengan Cluster Head)</w:t>
             </w:r>
           </w:p>
         </w:tc>
@@ -4477,7 +4477,7 @@
                 <w:highlight w:val="yellow"/>
                 <w:rtl w:val="0"/>
               </w:rPr>
-              <w:t xml:space="preserve">[Desktop/wall/panel – to be confirmed]</w:t>
+              <w:t>L-bracket / U-clamp ke struktur existing kilang, tanpa pengeboran/pengelasan (dec:27, dec:40)</w:t>
             </w:r>
           </w:p>
         </w:tc>
@@ -4523,7 +4523,7 @@
                 <w:highlight w:val="yellow"/>
                 <w:rtl w:val="0"/>
               </w:rPr>
-              <w:t xml:space="preserve">[to be confirmed]</w:t>
+              <w:t>Kemungkinan sama dengan Cluster Head (IP66/67) — belum eksplisit dikonfirmasi terpisah untuk unit Gateway</w:t>
             </w:r>
           </w:p>
         </w:tc>

</xml_diff>

<commit_message>
Rapikan format Dokumen_spesifikasi_input_2.docx: pisahkan nilai teknis ringkas dari catatan sumber
Nilai spesifikasi dikembalikan singkat (highlight kuning konsisten dgn gaya dokumen asli), catatan/sumber dipindah jadi baris italic kecil di bawahnya per sel, bukan digabung jadi satu kalimat panjang.

Co-Authored-By: Claude Sonnet 5 <noreply@anthropic.com>
</commit_message>
<xml_diff>
--- a/Dokumen_spesifikasi_input_2.docx
+++ b/Dokumen_spesifikasi_input_2.docx
@@ -181,7 +181,17 @@
                 <w:highlight w:val="yellow"/>
                 <w:rtl w:val="0"/>
               </w:rPr>
-              <w:t>Battery (jalur pengembangan terpisah/R&amp;D — TIDAK menghambat deployment; catu daya utama produksi = 24 VDC ≥2A/unit, dec:39)</w:t>
+              <w:t>Battery</w:t>
+            </w:r>
+          </w:p>
+          <w:p>
+            <w:r>
+              <w:rPr>
+                <w:i/>
+                <w:color w:val="595959"/>
+                <w:sz w:val="16"/>
+              </w:rPr>
+              <w:t>Catatan: Jalur pengembangan terpisah/R&amp;D — tidak menghambat deployment; catu daya utama produksi = 24 VDC ≥2A/unit (dec:39)</w:t>
             </w:r>
           </w:p>
         </w:tc>
@@ -227,7 +237,17 @@
                 <w:highlight w:val="yellow"/>
                 <w:rtl w:val="0"/>
               </w:rPr>
-              <w:t>220 VAC, 50 Hz (standar jaringan listrik PLN Indonesia)</w:t>
+              <w:t>220 VAC, 50 Hz</w:t>
+            </w:r>
+          </w:p>
+          <w:p>
+            <w:r>
+              <w:rPr>
+                <w:i/>
+                <w:color w:val="595959"/>
+                <w:sz w:val="16"/>
+              </w:rPr>
+              <w:t>Catatan: Standar jaringan listrik PLN Indonesia</w:t>
             </w:r>
           </w:p>
         </w:tc>
@@ -319,7 +339,17 @@
                 <w:highlight w:val="yellow"/>
                 <w:rtl w:val="0"/>
               </w:rPr>
-              <w:t>5 VDC (rail sensor/heater MQ) &amp; 3,3 VDC (logic ESP32-S3) — rincian arus tiap rail internal masih perlu didokumentasikan lebih lanjut</w:t>
+              <w:t>5 VDC &amp; 3,3 VDC</w:t>
+            </w:r>
+          </w:p>
+          <w:p>
+            <w:r>
+              <w:rPr>
+                <w:i/>
+                <w:color w:val="595959"/>
+                <w:sz w:val="16"/>
+              </w:rPr>
+              <w:t>Catatan: 5 VDC untuk rail sensor/heater MQ, 3,3 VDC untuk logic ESP32-S3 — rincian arus tiap rail internal masih perlu didokumentasikan</w:t>
             </w:r>
           </w:p>
         </w:tc>
@@ -365,7 +395,17 @@
                 <w:highlight w:val="yellow"/>
                 <w:rtl w:val="0"/>
               </w:rPr>
-              <w:t>±0,33 A @ 24 VDC (dihitung dari konsumsi daya maks 7,995 W ÷ 24 VDC, sesuai Parameter spesifikasi EMC_lengkap.docx)</w:t>
+              <w:t>±0,33 A @ 24 VDC</w:t>
+            </w:r>
+          </w:p>
+          <w:p>
+            <w:r>
+              <w:rPr>
+                <w:i/>
+                <w:color w:val="595959"/>
+                <w:sz w:val="16"/>
+              </w:rPr>
+              <w:t>Catatan: Dihitung dari konsumsi daya maks 7,995 W ÷ 24 VDC, sesuai Parameter spesifikasi EMC_lengkap.docx</w:t>
             </w:r>
           </w:p>
         </w:tc>
@@ -411,7 +451,17 @@
                 <w:highlight w:val="yellow"/>
                 <w:rtl w:val="0"/>
               </w:rPr>
-              <w:t>7,995 W @ 24 VDC (versi catu daya kontinu final, sesuai Parameter spesifikasi EMC_lengkap.docx &amp; dec:39). Catatan: draw ON versi baterai duty-cycled terukur terpisah 5,75 W (5V×1,15A) — beda mode operasi, bukan kontradiksi.</w:t>
+              <w:t>7,995 W @ 24 VDC</w:t>
+            </w:r>
+          </w:p>
+          <w:p>
+            <w:r>
+              <w:rPr>
+                <w:i/>
+                <w:color w:val="595959"/>
+                <w:sz w:val="16"/>
+              </w:rPr>
+              <w:t>Catatan: Versi catu daya kontinu final, sesuai Parameter spesifikasi EMC_lengkap.docx &amp; dec:39. Draw ON versi baterai duty-cycled terukur terpisah 5,75 W (5V×1,15A) — beda mode operasi, bukan kontradiksi</w:t>
             </w:r>
           </w:p>
         </w:tc>
@@ -457,7 +507,17 @@
                 <w:highlight w:val="yellow"/>
                 <w:rtl w:val="0"/>
               </w:rPr>
-              <w:t>Li-ion 18650, konfigurasi 7P (7 sel paralel) — jalur pengembangan terpisah (R&amp;D), TIDAK menghambat deployment versi 24 VDC (dec:39)</w:t>
+              <w:t>Li-ion 18650, konfigurasi 7P (7 sel paralel)</w:t>
+            </w:r>
+          </w:p>
+          <w:p>
+            <w:r>
+              <w:rPr>
+                <w:i/>
+                <w:color w:val="595959"/>
+                <w:sz w:val="16"/>
+              </w:rPr>
+              <w:t>Catatan: Jalur pengembangan terpisah (R&amp;D) — tidak menghambat deployment versi 24 VDC (dec:39)</w:t>
             </w:r>
           </w:p>
         </w:tc>
@@ -503,7 +563,17 @@
                 <w:highlight w:val="yellow"/>
                 <w:rtl w:val="0"/>
               </w:rPr>
-              <w:t>4,2 V (tegangan penuh/full-charge per sel; tegangan nominal Li-ion pada umumnya 3,7 V — perlu klarifikasi istilah pada dokumen asal)</w:t>
+              <w:t>4,2 V</w:t>
+            </w:r>
+          </w:p>
+          <w:p>
+            <w:r>
+              <w:rPr>
+                <w:i/>
+                <w:color w:val="595959"/>
+                <w:sz w:val="16"/>
+              </w:rPr>
+              <w:t>Catatan: Tegangan penuh/full-charge per sel; tegangan nominal Li-ion pada umumnya 3,7 V — perlu klarifikasi istilah pada dokumen asal</w:t>
             </w:r>
           </w:p>
         </w:tc>
@@ -549,7 +619,17 @@
                 <w:highlight w:val="yellow"/>
                 <w:rtl w:val="0"/>
               </w:rPr>
-              <w:t>28.000 mAh / 28 Ah total (konfigurasi 7P × 4.000 mAh, ≈70,4 Wh usable) — BUKAN salah ketik, sesuai data pengujian daya (Timeline Update Juli 2026)</w:t>
+              <w:t>28.000 mAh / 28 Ah total</w:t>
+            </w:r>
+          </w:p>
+          <w:p>
+            <w:r>
+              <w:rPr>
+                <w:i/>
+                <w:color w:val="595959"/>
+                <w:sz w:val="16"/>
+              </w:rPr>
+              <w:t>Catatan: Konfigurasi 7P × 4.000 mAh, ≈70,4 Wh usable — BUKAN salah ketik, sesuai data pengujian daya (Timeline Update Juli 2026)</w:t>
             </w:r>
           </w:p>
         </w:tc>
@@ -720,7 +800,17 @@
                 <w:highlight w:val="yellow"/>
                 <w:rtl w:val="0"/>
               </w:rPr>
-              <w:t>MQ-2, MQ-3B, MQ-4, MQ-5, MQ-6, MQ-7B, MQ-8, MQ-135 (8 kanal, sesuai Parameter spesifikasi EMC_lengkap.docx)</w:t>
+              <w:t>MQ-2, MQ-3B, MQ-4, MQ-5, MQ-6, MQ-7B, MQ-8, MQ-135</w:t>
+            </w:r>
+          </w:p>
+          <w:p>
+            <w:r>
+              <w:rPr>
+                <w:i/>
+                <w:color w:val="595959"/>
+                <w:sz w:val="16"/>
+              </w:rPr>
+              <w:t>Catatan: 8 kanal, sesuai Parameter spesifikasi EMC_lengkap.docx</w:t>
             </w:r>
           </w:p>
         </w:tc>
@@ -766,7 +856,17 @@
                 <w:highlight w:val="yellow"/>
                 <w:rtl w:val="0"/>
               </w:rPr>
-              <w:t>Tidak terpasang pada unit Node Sensor lapangan — BME280 ganda (internal/eksternal) hanya ada pada rig gas chamber R&amp;D terpisah; perlu klarifikasi apakah environmental sensor dimaksud untuk unit produksi</w:t>
+              <w:t>Belum terpasang pada unit produksi</w:t>
+            </w:r>
+          </w:p>
+          <w:p>
+            <w:r>
+              <w:rPr>
+                <w:i/>
+                <w:color w:val="595959"/>
+                <w:sz w:val="16"/>
+              </w:rPr>
+              <w:t>Catatan: BME280 ganda (internal/eksternal) hanya ada pada rig gas chamber R&amp;D terpisah; perlu klarifikasi apakah environmental sensor dimaksud untuk unit produksi</w:t>
             </w:r>
           </w:p>
         </w:tc>
@@ -812,7 +912,17 @@
                 <w:highlight w:val="yellow"/>
                 <w:rtl w:val="0"/>
               </w:rPr>
-              <w:t>ESP32-S3-WROOM-1U (sesuai Parameter spesifikasi EMC_lengkap.docx)</w:t>
+              <w:t>ESP32-S3-WROOM-1U</w:t>
+            </w:r>
+          </w:p>
+          <w:p>
+            <w:r>
+              <w:rPr>
+                <w:i/>
+                <w:color w:val="595959"/>
+                <w:sz w:val="16"/>
+              </w:rPr>
+              <w:t>Catatan: Sesuai Parameter spesifikasi EMC_lengkap.docx</w:t>
             </w:r>
           </w:p>
         </w:tc>
@@ -904,7 +1014,17 @@
                 <w:highlight w:val="yellow"/>
                 <w:rtl w:val="0"/>
               </w:rPr>
-              <w:t>920 MHz (konfigurasi STAR ke Cluster Head), dalam pita ISM regional 920–923 MHz — sesuai Parameter spesifikasi EMC_lengkap.docx</w:t>
+              <w:t>920 MHz</w:t>
+            </w:r>
+          </w:p>
+          <w:p>
+            <w:r>
+              <w:rPr>
+                <w:i/>
+                <w:color w:val="595959"/>
+                <w:sz w:val="16"/>
+              </w:rPr>
+              <w:t>Catatan: Konfigurasi STAR ke Cluster Head, dalam pita ISM regional 920–923 MHz — sesuai Parameter spesifikasi EMC_lengkap.docx</w:t>
             </w:r>
           </w:p>
         </w:tc>
@@ -950,7 +1070,17 @@
                 <w:highlight w:val="yellow"/>
                 <w:rtl w:val="0"/>
               </w:rPr>
-              <w:t>17 dBm (dikonfigurasi firmware; modul radio E22-900MM22S mampu maksimum 22 dBm — bukan kontradiksi, lihat dec:45)</w:t>
+              <w:t>17 dBm</w:t>
+            </w:r>
+          </w:p>
+          <w:p>
+            <w:r>
+              <w:rPr>
+                <w:i/>
+                <w:color w:val="595959"/>
+                <w:sz w:val="16"/>
+              </w:rPr>
+              <w:t>Catatan: Dikonfigurasi firmware; modul radio E22-900MM22S mampu maksimum 22 dBm — bukan kontradiksi (dec:45)</w:t>
             </w:r>
           </w:p>
         </w:tc>
@@ -996,7 +1126,17 @@
                 <w:highlight w:val="yellow"/>
                 <w:rtl w:val="0"/>
               </w:rPr>
-              <w:t>Eksternal, omnidirectional, konektor SMA Male, gain 3 dBi (sesuai Parameter spesifikasi EMC_lengkap.docx)</w:t>
+              <w:t>Eksternal, omnidirectional, SMA Male, 3 dBi</w:t>
+            </w:r>
+          </w:p>
+          <w:p>
+            <w:r>
+              <w:rPr>
+                <w:i/>
+                <w:color w:val="595959"/>
+                <w:sz w:val="16"/>
+              </w:rPr>
+              <w:t>Catatan: Sesuai Parameter spesifikasi EMC_lengkap.docx</w:t>
             </w:r>
           </w:p>
         </w:tc>
@@ -1042,7 +1182,17 @@
                 <w:highlight w:val="yellow"/>
                 <w:rtl w:val="0"/>
               </w:rPr>
-              <w:t>Configurable, default 10 s (dikonfirmasi sbg asumsi pengujian daya baterai Cluster Head)</w:t>
+              <w:t>Configurable, default 10 s</w:t>
+            </w:r>
+          </w:p>
+          <w:p>
+            <w:r>
+              <w:rPr>
+                <w:i/>
+                <w:color w:val="595959"/>
+                <w:sz w:val="16"/>
+              </w:rPr>
+              <w:t>Catatan: Dikonfirmasi sbg asumsi pengujian daya baterai Cluster Head</w:t>
             </w:r>
           </w:p>
         </w:tc>
@@ -1165,7 +1315,17 @@
                 <w:highlight w:val="yellow"/>
                 <w:rtl w:val="0"/>
               </w:rPr>
-              <w:t>Metal (sesuai Parameter spesifikasi EMC_lengkap.docx) — jenis/grade logam spesifik belum ditentukan; PVC dihindari untuk seluruh housing/bracket sesuai keputusan rapat 6 Agustus 2026 (dec:31)</w:t>
+              <w:t>Metal</w:t>
+            </w:r>
+          </w:p>
+          <w:p>
+            <w:r>
+              <w:rPr>
+                <w:i/>
+                <w:color w:val="595959"/>
+                <w:sz w:val="16"/>
+              </w:rPr>
+              <w:t>Catatan: Sesuai Parameter spesifikasi EMC_lengkap.docx; jenis/grade logam spesifik belum ditentukan. PVC dihindari untuk seluruh housing/bracket sesuai keputusan rapat 6 Agustus 2026 (dec:31)</w:t>
             </w:r>
           </w:p>
         </w:tc>
@@ -1211,7 +1371,17 @@
                 <w:highlight w:val="yellow"/>
                 <w:rtl w:val="0"/>
               </w:rPr>
-              <w:t>200 × 90 × 290 mm (20×9×29 cm, sesuai Parameter spesifikasi EMC_lengkap.docx)</w:t>
+              <w:t>200 × 90 × 290 mm</w:t>
+            </w:r>
+          </w:p>
+          <w:p>
+            <w:r>
+              <w:rPr>
+                <w:i/>
+                <w:color w:val="595959"/>
+                <w:sz w:val="16"/>
+              </w:rPr>
+              <w:t>Catatan: 20×9×29 cm, sesuai Parameter spesifikasi EMC_lengkap.docx</w:t>
             </w:r>
           </w:p>
         </w:tc>
@@ -1303,7 +1473,17 @@
                 <w:highlight w:val="yellow"/>
                 <w:rtl w:val="0"/>
               </w:rPr>
-              <w:t>L-bracket, referensi desain sistem Corrosion Monitoring Emerson, dipasang ke struktur existing kilang tanpa pengeboran/pengelasan (dec:27, dec:40)</w:t>
+              <w:t>L-bracket, ref. desain Emerson</w:t>
+            </w:r>
+          </w:p>
+          <w:p>
+            <w:r>
+              <w:rPr>
+                <w:i/>
+                <w:color w:val="595959"/>
+                <w:sz w:val="16"/>
+              </w:rPr>
+              <w:t>Catatan: Dipasang ke struktur existing kilang tanpa pengeboran/pengelasan (dec:27, dec:40)</w:t>
             </w:r>
           </w:p>
         </w:tc>
@@ -1441,7 +1621,17 @@
                 <w:highlight w:val="yellow"/>
                 <w:rtl w:val="0"/>
               </w:rPr>
-              <w:t>Eksternal (konektor SMA Male). Catatan: pada beberapa unit, antena Wi-Fi 2,4G masih di dalam casing dan perlu dikeluarkan agar konfigurasi channel berfungsi andal (temuan weekly meeting 30 Jul 2026)</w:t>
+              <w:t>Eksternal (SMA Male)</w:t>
+            </w:r>
+          </w:p>
+          <w:p>
+            <w:r>
+              <w:rPr>
+                <w:i/>
+                <w:color w:val="595959"/>
+                <w:sz w:val="16"/>
+              </w:rPr>
+              <w:t>Catatan: Pada beberapa unit, antena Wi-Fi 2,4G masih di dalam casing dan perlu dikeluarkan agar konfigurasi channel berfungsi andal (weekly meeting 30 Jul 2026)</w:t>
             </w:r>
           </w:p>
         </w:tc>
@@ -1766,7 +1956,17 @@
                 <w:highlight w:val="yellow"/>
                 <w:rtl w:val="0"/>
               </w:rPr>
-              <w:t>Li-ion 18650 (sel sama dengan Node Sensor) — keamanan sel/BMS di kondisi kilang BELUM didokumentasikan (gate:ch-batt-safety, dec:41)</w:t>
+              <w:t>Li-ion 18650</w:t>
+            </w:r>
+          </w:p>
+          <w:p>
+            <w:r>
+              <w:rPr>
+                <w:i/>
+                <w:color w:val="595959"/>
+                <w:sz w:val="16"/>
+              </w:rPr>
+              <w:t>Catatan: Sel sama dengan Node Sensor — keamanan sel/BMS di kondisi kilang BELUM didokumentasikan (gate:ch-batt-safety, dec:41)</w:t>
             </w:r>
           </w:p>
         </w:tc>
@@ -1812,7 +2012,17 @@
                 <w:highlight w:val="yellow"/>
                 <w:rtl w:val="0"/>
               </w:rPr>
-              <w:t>4,2 V (tegangan penuh/full-charge; tegangan nominal Li-ion pada umumnya 3,7 V — perlu klarifikasi istilah)</w:t>
+              <w:t>4,2 V</w:t>
+            </w:r>
+          </w:p>
+          <w:p>
+            <w:r>
+              <w:rPr>
+                <w:i/>
+                <w:color w:val="595959"/>
+                <w:sz w:val="16"/>
+              </w:rPr>
+              <w:t>Catatan: Tegangan penuh/full-charge; tegangan nominal Li-ion pada umumnya 3,7 V — perlu klarifikasi istilah</w:t>
             </w:r>
           </w:p>
         </w:tc>
@@ -1904,7 +2114,17 @@
                 <w:highlight w:val="yellow"/>
                 <w:rtl w:val="0"/>
               </w:rPr>
-              <w:t>±6,51 Wp per panel (Isc 1,29 A); 2 panel terpasang per Cluster Head menghasilkan surplus energi 1,5–4,4 Wh/hari dibanding kebutuhan ≈7,56 Wh/hari (data Timeline Update Juli 2026)</w:t>
+              <w:t>±6,51 Wp per panel</w:t>
+            </w:r>
+          </w:p>
+          <w:p>
+            <w:r>
+              <w:rPr>
+                <w:i/>
+                <w:color w:val="595959"/>
+                <w:sz w:val="16"/>
+              </w:rPr>
+              <w:t>Catatan: Isc 1,29 A; 2 panel per Cluster Head menghasilkan surplus energi 1,5–4,4 Wh/hari dibanding kebutuhan ≈7,56 Wh/hari (Timeline Update Juli 2026)</w:t>
             </w:r>
           </w:p>
         </w:tc>
@@ -1950,7 +2170,17 @@
                 <w:highlight w:val="yellow"/>
                 <w:rtl w:val="0"/>
               </w:rPr>
-              <w:t>≈7,77 V (titik operasi terukur panel, arus 0,74 A)</w:t>
+              <w:t>≈7,77 V</w:t>
+            </w:r>
+          </w:p>
+          <w:p>
+            <w:r>
+              <w:rPr>
+                <w:i/>
+                <w:color w:val="595959"/>
+                <w:sz w:val="16"/>
+              </w:rPr>
+              <w:t>Catatan: Titik operasi terukur panel, arus 0,74 A</w:t>
             </w:r>
           </w:p>
         </w:tc>
@@ -1996,7 +2226,17 @@
                 <w:highlight w:val="yellow"/>
                 <w:rtl w:val="0"/>
               </w:rPr>
-              <w:t>BQ25185 (Texas Instruments) — IC charger + power path management solar/baterai</w:t>
+              <w:t>BQ25185 (Texas Instruments)</w:t>
+            </w:r>
+          </w:p>
+          <w:p>
+            <w:r>
+              <w:rPr>
+                <w:i/>
+                <w:color w:val="595959"/>
+                <w:sz w:val="16"/>
+              </w:rPr>
+              <w:t>Catatan: IC charger + power path management solar/baterai</w:t>
             </w:r>
           </w:p>
         </w:tc>
@@ -2042,7 +2282,17 @@
                 <w:highlight w:val="yellow"/>
                 <w:rtl w:val="0"/>
               </w:rPr>
-              <w:t>3,3 VDC (via regulator buck-boost TPS63020)</w:t>
+              <w:t>3,3 VDC</w:t>
+            </w:r>
+          </w:p>
+          <w:p>
+            <w:r>
+              <w:rPr>
+                <w:i/>
+                <w:color w:val="595959"/>
+                <w:sz w:val="16"/>
+              </w:rPr>
+              <w:t>Catatan: Via regulator buck-boost TPS63020</w:t>
             </w:r>
           </w:p>
         </w:tc>
@@ -2134,7 +2384,17 @@
                 <w:highlight w:val="yellow"/>
                 <w:rtl w:val="0"/>
               </w:rPr>
-              <w:t>0,73 W (sesuai Parameter spesifikasi EMC_lengkap.docx). Catatan: konsumsi rata-rata terukur di lapangan ≈84 mA (≈7,56 Wh/hari) — basis pengukuran (maks vs rata-rata operasional) berbeda, belum direkonsiliasi formal (gate:ch-power-spec)</w:t>
+              <w:t>0,73 W</w:t>
+            </w:r>
+          </w:p>
+          <w:p>
+            <w:r>
+              <w:rPr>
+                <w:i/>
+                <w:color w:val="595959"/>
+                <w:sz w:val="16"/>
+              </w:rPr>
+              <w:t>Catatan: Sesuai Parameter spesifikasi EMC_lengkap.docx. Konsumsi rata-rata terukur lapangan ≈84 mA (≈7,56 Wh/hari) — basis pengukuran (maks vs rata-rata) berbeda, belum direkonsiliasi (gate:ch-power-spec)</w:t>
             </w:r>
           </w:p>
         </w:tc>
@@ -2180,7 +2440,17 @@
                 <w:highlight w:val="yellow"/>
                 <w:rtl w:val="0"/>
               </w:rPr>
-              <w:t>Sebagian ditangani IC charger BQ25185 (proteksi pengisian baterai standar) — rincian proteksi sirkuit lengkap (short-circuit/reverse polarity) belum didokumentasikan</w:t>
+              <w:t>Sebagian oleh IC charger BQ25185</w:t>
+            </w:r>
+          </w:p>
+          <w:p>
+            <w:r>
+              <w:rPr>
+                <w:i/>
+                <w:color w:val="595959"/>
+                <w:sz w:val="16"/>
+              </w:rPr>
+              <w:t>Catatan: Proteksi pengisian baterai standar; rincian proteksi sirkuit lengkap (short-circuit/reverse polarity) belum didokumentasikan</w:t>
             </w:r>
           </w:p>
         </w:tc>
@@ -2305,7 +2575,17 @@
                 <w:highlight w:val="yellow"/>
                 <w:rtl w:val="0"/>
               </w:rPr>
-              <w:t>LoRa (topologi STAR, Node Sensor → Cluster Head)</w:t>
+              <w:t>LoRa</w:t>
+            </w:r>
+          </w:p>
+          <w:p>
+            <w:r>
+              <w:rPr>
+                <w:i/>
+                <w:color w:val="595959"/>
+                <w:sz w:val="16"/>
+              </w:rPr>
+              <w:t>Catatan: Topologi STAR, Node Sensor → Cluster Head</w:t>
             </w:r>
           </w:p>
         </w:tc>
@@ -2351,7 +2631,17 @@
                 <w:highlight w:val="yellow"/>
                 <w:rtl w:val="0"/>
               </w:rPr>
-              <w:t>LoRa (topologi MESH multi-hop, antar-Cluster Head → Gateway)</w:t>
+              <w:t>LoRa</w:t>
+            </w:r>
+          </w:p>
+          <w:p>
+            <w:r>
+              <w:rPr>
+                <w:i/>
+                <w:color w:val="595959"/>
+                <w:sz w:val="16"/>
+              </w:rPr>
+              <w:t>Catatan: Topologi MESH multi-hop, antar-Cluster Head → Gateway</w:t>
             </w:r>
           </w:p>
         </w:tc>
@@ -2397,7 +2687,17 @@
                 <w:highlight w:val="yellow"/>
                 <w:rtl w:val="0"/>
               </w:rPr>
-              <w:t>920 MHz (STAR, ke Node Sensor) / 921 MHz (MESH, antar-CH ke Gateway) — sesuai Parameter spesifikasi EMC_lengkap.docx</w:t>
+              <w:t>920 MHz (STAR) / 921 MHz (MESH)</w:t>
+            </w:r>
+          </w:p>
+          <w:p>
+            <w:r>
+              <w:rPr>
+                <w:i/>
+                <w:color w:val="595959"/>
+                <w:sz w:val="16"/>
+              </w:rPr>
+              <w:t>Catatan: Sesuai Parameter spesifikasi EMC_lengkap.docx</w:t>
             </w:r>
           </w:p>
         </w:tc>
@@ -2443,7 +2743,17 @@
                 <w:highlight w:val="yellow"/>
                 <w:rtl w:val="0"/>
               </w:rPr>
-              <w:t>22 dBm (maksimum modul radio E22-900MM22S, sesuai Parameter spesifikasi EMC_lengkap.docx)</w:t>
+              <w:t>22 dBm</w:t>
+            </w:r>
+          </w:p>
+          <w:p>
+            <w:r>
+              <w:rPr>
+                <w:i/>
+                <w:color w:val="595959"/>
+                <w:sz w:val="16"/>
+              </w:rPr>
+              <w:t>Catatan: Maksimum modul radio E22-900MM22S, sesuai Parameter spesifikasi EMC_lengkap.docx</w:t>
             </w:r>
           </w:p>
         </w:tc>
@@ -2489,7 +2799,17 @@
                 <w:highlight w:val="yellow"/>
                 <w:rtl w:val="0"/>
               </w:rPr>
-              <w:t>Fiber omnidirectional (sesuai Parameter spesifikasi EMC_lengkap.docx)</w:t>
+              <w:t>Fiber omnidirectional</w:t>
+            </w:r>
+          </w:p>
+          <w:p>
+            <w:r>
+              <w:rPr>
+                <w:i/>
+                <w:color w:val="595959"/>
+                <w:sz w:val="16"/>
+              </w:rPr>
+              <w:t>Catatan: Sesuai Parameter spesifikasi EMC_lengkap.docx</w:t>
             </w:r>
           </w:p>
         </w:tc>
@@ -2535,7 +2855,17 @@
                 <w:highlight w:val="yellow"/>
                 <w:rtl w:val="0"/>
               </w:rPr>
-              <w:t>3 dBi (STAR, ke Node Sensor) / 8 dBi (MESH, antar-CH) — sesuai Parameter spesifikasi EMC_lengkap.docx</w:t>
+              <w:t>3 dBi (STAR) / 8 dBi (MESH)</w:t>
+            </w:r>
+          </w:p>
+          <w:p>
+            <w:r>
+              <w:rPr>
+                <w:i/>
+                <w:color w:val="595959"/>
+                <w:sz w:val="16"/>
+              </w:rPr>
+              <w:t>Catatan: Sesuai Parameter spesifikasi EMC_lengkap.docx</w:t>
             </w:r>
           </w:p>
         </w:tc>
@@ -2581,7 +2911,17 @@
                 <w:highlight w:val="yellow"/>
                 <w:rtl w:val="0"/>
               </w:rPr>
-              <w:t>Installation/environment dependent — referensi pengujian lapangan: ~100 m @ −71 dBm (PDR 100%), hingga 242 m PDR 100% (area terbuka), turun ke PDR 26% pada −112 dBm (data uji RF LoRa internal)</w:t>
+              <w:t>Installation/environment dependent</w:t>
+            </w:r>
+          </w:p>
+          <w:p>
+            <w:r>
+              <w:rPr>
+                <w:i/>
+                <w:color w:val="595959"/>
+                <w:sz w:val="16"/>
+              </w:rPr>
+              <w:t>Catatan: Referensi lapangan: ~100 m @ −71 dBm (PDR 100%), hingga 242 m PDR 100% (area terbuka), turun ke PDR 26% pada −112 dBm (data uji RF LoRa internal)</w:t>
             </w:r>
           </w:p>
         </w:tc>
@@ -2627,7 +2967,17 @@
                 <w:highlight w:val="yellow"/>
                 <w:rtl w:val="0"/>
               </w:rPr>
-              <w:t>Belum ada angka resmi — action item terbuka (Tim Komunikasi ITB, gate:capacity); jangan kutip angka spesifik sebelum dikonfirmasi resmi</w:t>
+              <w:t>Belum ada angka resmi</w:t>
+            </w:r>
+          </w:p>
+          <w:p>
+            <w:r>
+              <w:rPr>
+                <w:i/>
+                <w:color w:val="595959"/>
+                <w:sz w:val="16"/>
+              </w:rPr>
+              <w:t>Catatan: Action item terbuka (Tim Komunikasi ITB, gate:capacity) — jangan kutip angka spesifik sebelum dikonfirmasi resmi</w:t>
             </w:r>
           </w:p>
         </w:tc>
@@ -2798,7 +3148,17 @@
                 <w:highlight w:val="yellow"/>
                 <w:rtl w:val="0"/>
               </w:rPr>
-              <w:t>Metal (sesuai Parameter spesifikasi EMC_lengkap.docx); PVC dihindari sesuai keputusan rapat 6 Agustus 2026 (dec:31)</w:t>
+              <w:t>Metal</w:t>
+            </w:r>
+          </w:p>
+          <w:p>
+            <w:r>
+              <w:rPr>
+                <w:i/>
+                <w:color w:val="595959"/>
+                <w:sz w:val="16"/>
+              </w:rPr>
+              <w:t>Catatan: Sesuai Parameter spesifikasi EMC_lengkap.docx; PVC dihindari sesuai keputusan rapat 6 Agustus 2026 (dec:31)</w:t>
             </w:r>
           </w:p>
         </w:tc>
@@ -2844,7 +3204,17 @@
                 <w:highlight w:val="yellow"/>
                 <w:rtl w:val="0"/>
               </w:rPr>
-              <w:t>80 × 80 × 210 mm (8×8×21 cm, sesuai Parameter spesifikasi EMC_lengkap.docx)</w:t>
+              <w:t>80 × 80 × 210 mm</w:t>
+            </w:r>
+          </w:p>
+          <w:p>
+            <w:r>
+              <w:rPr>
+                <w:i/>
+                <w:color w:val="595959"/>
+                <w:sz w:val="16"/>
+              </w:rPr>
+              <w:t>Catatan: 8×8×21 cm, sesuai Parameter spesifikasi EMC_lengkap.docx</w:t>
             </w:r>
           </w:p>
         </w:tc>
@@ -2936,7 +3306,17 @@
                 <w:highlight w:val="yellow"/>
                 <w:rtl w:val="0"/>
               </w:rPr>
-              <w:t>L-bracket, referensi desain Emerson, dipasang satu tiang bersama panel solar (dec:40)</w:t>
+              <w:t>L-bracket, ref. desain Emerson</w:t>
+            </w:r>
+          </w:p>
+          <w:p>
+            <w:r>
+              <w:rPr>
+                <w:i/>
+                <w:color w:val="595959"/>
+                <w:sz w:val="16"/>
+              </w:rPr>
+              <w:t>Catatan: Dipasang satu tiang bersama panel solar (dec:40)</w:t>
             </w:r>
           </w:p>
         </w:tc>
@@ -2982,7 +3362,17 @@
                 <w:highlight w:val="yellow"/>
                 <w:rtl w:val="0"/>
               </w:rPr>
-              <w:t>IP66/67 (dikonfirmasi pada dokumentasi internal proyek)</w:t>
+              <w:t>IP66/67</w:t>
+            </w:r>
+          </w:p>
+          <w:p>
+            <w:r>
+              <w:rPr>
+                <w:i/>
+                <w:color w:val="595959"/>
+                <w:sz w:val="16"/>
+              </w:rPr>
+              <w:t>Catatan: Dikonfirmasi pada dokumentasi internal proyek</w:t>
             </w:r>
           </w:p>
         </w:tc>
@@ -3120,7 +3510,17 @@
                 <w:highlight w:val="yellow"/>
                 <w:rtl w:val="0"/>
               </w:rPr>
-              <w:t>External mounting structure (tiang ±6 m)</w:t>
+              <w:t>External mounting structure</w:t>
+            </w:r>
+          </w:p>
+          <w:p>
+            <w:r>
+              <w:rPr>
+                <w:i/>
+                <w:color w:val="595959"/>
+                <w:sz w:val="16"/>
+              </w:rPr>
+              <w:t>Catatan: Tiang ±6 m</w:t>
             </w:r>
           </w:p>
         </w:tc>
@@ -3445,7 +3845,17 @@
                 <w:highlight w:val="yellow"/>
                 <w:rtl w:val="0"/>
               </w:rPr>
-              <w:t>220 VAC, 50 Hz (standar jaringan listrik PLN Indonesia)</w:t>
+              <w:t>220 VAC, 50 Hz</w:t>
+            </w:r>
+          </w:p>
+          <w:p>
+            <w:r>
+              <w:rPr>
+                <w:i/>
+                <w:color w:val="595959"/>
+                <w:sz w:val="16"/>
+              </w:rPr>
+              <w:t>Catatan: Standar jaringan listrik PLN Indonesia</w:t>
             </w:r>
           </w:p>
         </w:tc>
@@ -3537,7 +3947,17 @@
                 <w:highlight w:val="yellow"/>
                 <w:rtl w:val="0"/>
               </w:rPr>
-              <w:t>≈0,146 A (dihitung dari konsumsi daya maks 0,73 W ÷ 5 VDC, sesuai Parameter spesifikasi EMC_lengkap.docx)</w:t>
+              <w:t>≈0,146 A</w:t>
+            </w:r>
+          </w:p>
+          <w:p>
+            <w:r>
+              <w:rPr>
+                <w:i/>
+                <w:color w:val="595959"/>
+                <w:sz w:val="16"/>
+              </w:rPr>
+              <w:t>Catatan: Dihitung dari konsumsi daya maks 0,73 W ÷ 5 VDC, sesuai Parameter spesifikasi EMC_lengkap.docx</w:t>
             </w:r>
           </w:p>
         </w:tc>
@@ -3583,7 +4003,17 @@
                 <w:highlight w:val="yellow"/>
                 <w:rtl w:val="0"/>
               </w:rPr>
-              <w:t>0,73 W (sesuai Parameter spesifikasi EMC_lengkap.docx)</w:t>
+              <w:t>0,73 W</w:t>
+            </w:r>
+          </w:p>
+          <w:p>
+            <w:r>
+              <w:rPr>
+                <w:i/>
+                <w:color w:val="595959"/>
+                <w:sz w:val="16"/>
+              </w:rPr>
+              <w:t>Catatan: Sesuai Parameter spesifikasi EMC_lengkap.docx</w:t>
             </w:r>
           </w:p>
         </w:tc>
@@ -3846,7 +4276,17 @@
                 <w:highlight w:val="yellow"/>
                 <w:rtl w:val="0"/>
               </w:rPr>
-              <w:t>921 MHz (sesuai Parameter spesifikasi EMC_lengkap.docx)</w:t>
+              <w:t>921 MHz</w:t>
+            </w:r>
+          </w:p>
+          <w:p>
+            <w:r>
+              <w:rPr>
+                <w:i/>
+                <w:color w:val="595959"/>
+                <w:sz w:val="16"/>
+              </w:rPr>
+              <w:t>Catatan: Sesuai Parameter spesifikasi EMC_lengkap.docx</w:t>
             </w:r>
           </w:p>
         </w:tc>
@@ -3892,7 +4332,17 @@
                 <w:highlight w:val="yellow"/>
                 <w:rtl w:val="0"/>
               </w:rPr>
-              <w:t>22 dBm (maksimum modul radio E22-900MM22S, sesuai Parameter spesifikasi EMC_lengkap.docx)</w:t>
+              <w:t>22 dBm</w:t>
+            </w:r>
+          </w:p>
+          <w:p>
+            <w:r>
+              <w:rPr>
+                <w:i/>
+                <w:color w:val="595959"/>
+                <w:sz w:val="16"/>
+              </w:rPr>
+              <w:t>Catatan: Maksimum modul radio E22-900MM22S, sesuai Parameter spesifikasi EMC_lengkap.docx</w:t>
             </w:r>
           </w:p>
         </w:tc>
@@ -3938,7 +4388,17 @@
                 <w:highlight w:val="yellow"/>
                 <w:rtl w:val="0"/>
               </w:rPr>
-              <w:t>Fiber omnidirectional (sesuai Parameter spesifikasi EMC_lengkap.docx)</w:t>
+              <w:t>Fiber omnidirectional</w:t>
+            </w:r>
+          </w:p>
+          <w:p>
+            <w:r>
+              <w:rPr>
+                <w:i/>
+                <w:color w:val="595959"/>
+                <w:sz w:val="16"/>
+              </w:rPr>
+              <w:t>Catatan: Sesuai Parameter spesifikasi EMC_lengkap.docx</w:t>
             </w:r>
           </w:p>
         </w:tc>
@@ -3984,7 +4444,17 @@
                 <w:highlight w:val="yellow"/>
                 <w:rtl w:val="0"/>
               </w:rPr>
-              <w:t>8 dBi (sesuai Parameter spesifikasi EMC_lengkap.docx)</w:t>
+              <w:t>8 dBi</w:t>
+            </w:r>
+          </w:p>
+          <w:p>
+            <w:r>
+              <w:rPr>
+                <w:i/>
+                <w:color w:val="595959"/>
+                <w:sz w:val="16"/>
+              </w:rPr>
+              <w:t>Catatan: Sesuai Parameter spesifikasi EMC_lengkap.docx</w:t>
             </w:r>
           </w:p>
         </w:tc>
@@ -4030,7 +4500,17 @@
                 <w:highlight w:val="yellow"/>
                 <w:rtl w:val="0"/>
               </w:rPr>
-              <w:t>Port Ethernet tersedia secara fisik (sesuai spek EMC) dan/atau Wi-Fi; dukungan firmware Gateway thd jalur Ethernet BELUM dikonfirmasi (gate:gw-ethernet). Gateway wajib terdaftar di jaringan intranet kilang (MAC address, DHCP reservation/IP statis — dec:42)</w:t>
+              <w:t>Ethernet dan/atau Wi-Fi</w:t>
+            </w:r>
+          </w:p>
+          <w:p>
+            <w:r>
+              <w:rPr>
+                <w:i/>
+                <w:color w:val="595959"/>
+                <w:sz w:val="16"/>
+              </w:rPr>
+              <w:t>Catatan: Port Ethernet tersedia fisik (spek EMC); dukungan firmware BELUM dikonfirmasi (gate:gw-ethernet). Gateway wajib terdaftar di jaringan intranet kilang — MAC address, DHCP reservation/IP statis (dec:42)</w:t>
             </w:r>
           </w:p>
         </w:tc>
@@ -4076,7 +4556,17 @@
                 <w:highlight w:val="yellow"/>
                 <w:rtl w:val="0"/>
               </w:rPr>
-              <w:t>Tersedia secara fisik pada hardware Gateway (Parameter spesifikasi EMC_lengkap.docx); dukungan firmware belum dikonfirmasi (gate:gw-ethernet)</w:t>
+              <w:t>Tersedia secara fisik</w:t>
+            </w:r>
+          </w:p>
+          <w:p>
+            <w:r>
+              <w:rPr>
+                <w:i/>
+                <w:color w:val="595959"/>
+                <w:sz w:val="16"/>
+              </w:rPr>
+              <w:t>Catatan: Pada hardware Gateway (Parameter spesifikasi EMC_lengkap.docx); dukungan firmware belum dikonfirmasi (gate:gw-ethernet)</w:t>
             </w:r>
           </w:p>
         </w:tc>
@@ -4122,7 +4612,17 @@
                 <w:highlight w:val="yellow"/>
                 <w:rtl w:val="0"/>
               </w:rPr>
-              <w:t>Kemungkinan tersedia untuk uplink Gateway — catatan dec:23 ("Wi-Fi hanya untuk konfigurasi lokal") ditujukan pada Node Sensor; peran Wi-Fi pada Gateway belum eksplisit dikonfirmasi terpisah</w:t>
+              <w:t>Kemungkinan tersedia untuk uplink</w:t>
+            </w:r>
+          </w:p>
+          <w:p>
+            <w:r>
+              <w:rPr>
+                <w:i/>
+                <w:color w:val="595959"/>
+                <w:sz w:val="16"/>
+              </w:rPr>
+              <w:t>Catatan: Catatan dec:23 ("Wi-Fi hanya utk config lokal") ditujukan pada Node Sensor; peran Wi-Fi pada Gateway belum eksplisit dikonfirmasi terpisah</w:t>
             </w:r>
           </w:p>
         </w:tc>
@@ -4168,7 +4668,17 @@
                 <w:highlight w:val="yellow"/>
                 <w:rtl w:val="0"/>
               </w:rPr>
-              <w:t>Disebutkan sbg opsi uplink pada dokumentasi arsitektur (WiFi/4G); implementasi 4G aktual pada unit Gateway saat ini belum dikonfirmasi terpasang</w:t>
+              <w:t>Disebutkan sbg opsi (WiFi/4G)</w:t>
+            </w:r>
+          </w:p>
+          <w:p>
+            <w:r>
+              <w:rPr>
+                <w:i/>
+                <w:color w:val="595959"/>
+                <w:sz w:val="16"/>
+              </w:rPr>
+              <w:t>Catatan: Implementasi 4G aktual pada unit Gateway saat ini belum dikonfirmasi terpasang</w:t>
             </w:r>
           </w:p>
         </w:tc>
@@ -4214,7 +4724,17 @@
                 <w:highlight w:val="yellow"/>
                 <w:rtl w:val="0"/>
               </w:rPr>
-              <w:t>MQTT — kontrak topik &amp; keamanan dijelaskan pada dokumen internal proyek (masih berstatus draft, belum ada bukti broker/deployment live)</w:t>
+              <w:t>MQTT</w:t>
+            </w:r>
+          </w:p>
+          <w:p>
+            <w:r>
+              <w:rPr>
+                <w:i/>
+                <w:color w:val="595959"/>
+                <w:sz w:val="16"/>
+              </w:rPr>
+              <w:t>Catatan: Kontrak topik &amp; keamanan dijelaskan pada dokumen internal proyek — masih berstatus draft, belum ada bukti broker/deployment live</w:t>
             </w:r>
           </w:p>
         </w:tc>
@@ -4339,7 +4859,17 @@
                 <w:highlight w:val="yellow"/>
                 <w:rtl w:val="0"/>
               </w:rPr>
-              <w:t>Metal (housing sama dengan Cluster Head, sesuai Parameter spesifikasi EMC_lengkap.docx)</w:t>
+              <w:t>Metal</w:t>
+            </w:r>
+          </w:p>
+          <w:p>
+            <w:r>
+              <w:rPr>
+                <w:i/>
+                <w:color w:val="595959"/>
+                <w:sz w:val="16"/>
+              </w:rPr>
+              <w:t>Catatan: Housing sama dengan Cluster Head, sesuai Parameter spesifikasi EMC_lengkap.docx</w:t>
             </w:r>
           </w:p>
         </w:tc>
@@ -4385,7 +4915,17 @@
                 <w:highlight w:val="yellow"/>
                 <w:rtl w:val="0"/>
               </w:rPr>
-              <w:t>80 × 80 × 210 mm (8×8×21 cm — housing sama dengan Cluster Head)</w:t>
+              <w:t>80 × 80 × 210 mm</w:t>
+            </w:r>
+          </w:p>
+          <w:p>
+            <w:r>
+              <w:rPr>
+                <w:i/>
+                <w:color w:val="595959"/>
+                <w:sz w:val="16"/>
+              </w:rPr>
+              <w:t>Catatan: 8×8×21 cm — housing sama dengan Cluster Head</w:t>
             </w:r>
           </w:p>
         </w:tc>
@@ -4477,7 +5017,17 @@
                 <w:highlight w:val="yellow"/>
                 <w:rtl w:val="0"/>
               </w:rPr>
-              <w:t>L-bracket / U-clamp ke struktur existing kilang, tanpa pengeboran/pengelasan (dec:27, dec:40)</w:t>
+              <w:t>L-bracket / U-clamp</w:t>
+            </w:r>
+          </w:p>
+          <w:p>
+            <w:r>
+              <w:rPr>
+                <w:i/>
+                <w:color w:val="595959"/>
+                <w:sz w:val="16"/>
+              </w:rPr>
+              <w:t>Catatan: Ke struktur existing kilang, tanpa pengeboran/pengelasan (dec:27, dec:40)</w:t>
             </w:r>
           </w:p>
         </w:tc>
@@ -4523,7 +5073,17 @@
                 <w:highlight w:val="yellow"/>
                 <w:rtl w:val="0"/>
               </w:rPr>
-              <w:t>Kemungkinan sama dengan Cluster Head (IP66/67) — belum eksplisit dikonfirmasi terpisah untuk unit Gateway</w:t>
+              <w:t>Kemungkinan sama dengan Cluster Head (IP66/67)</w:t>
+            </w:r>
+          </w:p>
+          <w:p>
+            <w:r>
+              <w:rPr>
+                <w:i/>
+                <w:color w:val="595959"/>
+                <w:sz w:val="16"/>
+              </w:rPr>
+              <w:t>Catatan: Belum eksplisit dikonfirmasi terpisah untuk unit Gateway</w:t>
             </w:r>
           </w:p>
         </w:tc>

</xml_diff>

<commit_message>
Konfirmasi spesifikasi solar panel CH (10-12 Wp) & baterai LiitoKala; tambah tabel status kekurangan
Co-Authored-By: Claude Sonnet 5 <noreply@anthropic.com>
</commit_message>
<xml_diff>
--- a/Dokumen_spesifikasi_input_2.docx
+++ b/Dokumen_spesifikasi_input_2.docx
@@ -507,7 +507,7 @@
                 <w:highlight w:val="yellow"/>
                 <w:rtl w:val="0"/>
               </w:rPr>
-              <w:t>Li-ion 18650, konfigurasi 7P (7 sel paralel)</w:t>
+              <w:t>Li-ion 18650 (merek LiitoKala), konfigurasi 7P (7 sel paralel)</w:t>
             </w:r>
           </w:p>
           <w:p>
@@ -517,7 +517,7 @@
                 <w:color w:val="595959"/>
                 <w:sz w:val="16"/>
               </w:rPr>
-              <w:t>Catatan: Jalur pengembangan terpisah (R&amp;D) — tidak menghambat deployment versi 24 VDC (dec:39)</w:t>
+              <w:t>Catatan: Merek baterai dikonfirmasi user (26 Agu 2026): LiitoKala. Jalur pengembangan terpisah (R&amp;D) — tidak menghambat deployment versi 24 VDC (dec:39)</w:t>
             </w:r>
           </w:p>
         </w:tc>
@@ -1956,7 +1956,7 @@
                 <w:highlight w:val="yellow"/>
                 <w:rtl w:val="0"/>
               </w:rPr>
-              <w:t>Li-ion 18650</w:t>
+              <w:t>Li-ion 18650 (merek LiitoKala)</w:t>
             </w:r>
           </w:p>
           <w:p>
@@ -1966,7 +1966,7 @@
                 <w:color w:val="595959"/>
                 <w:sz w:val="16"/>
               </w:rPr>
-              <w:t>Catatan: Sel sama dengan Node Sensor — keamanan sel/BMS di kondisi kilang BELUM didokumentasikan (gate:ch-batt-safety, dec:41)</w:t>
+              <w:t>Catatan: Merek baterai dikonfirmasi user (26 Agu 2026). Sel sama dengan Node Sensor — keamanan sel/BMS di kondisi kilang BELUM didokumentasikan (gate:ch-batt-safety, dec:41)</w:t>
             </w:r>
           </w:p>
         </w:tc>
@@ -2114,7 +2114,7 @@
                 <w:highlight w:val="yellow"/>
                 <w:rtl w:val="0"/>
               </w:rPr>
-              <w:t>±6,51 Wp per panel</w:t>
+              <w:t>10–12 Wp per panel</w:t>
             </w:r>
           </w:p>
           <w:p>
@@ -2124,7 +2124,7 @@
                 <w:color w:val="595959"/>
                 <w:sz w:val="16"/>
               </w:rPr>
-              <w:t>Catatan: Isc 1,29 A; 2 panel per Cluster Head menghasilkan surplus energi 1,5–4,4 Wh/hari dibanding kebutuhan ≈7,56 Wh/hari (Timeline Update Juli 2026)</w:t>
+              <w:t>Catatan: Spesifikasi final dikonfirmasi user (26 Agu 2026). Nilai sebelumnya dari pengukuran lapangan proyek (±6,51 Wp/panel, Isc 1,29 A) — mendekati rentang ini, dianggap konsisten. Sertifikasi hazardous/flammable area untuk panel ini masih terbuka (gate:solar-cert)</w:t>
             </w:r>
           </w:p>
         </w:tc>

</xml_diff>

<commit_message>
Catat material casing final: aluminum alloy + stainless steel untuk Node Sensor, Cluster Head, Gateway
Co-Authored-By: Claude Sonnet 5 <noreply@anthropic.com>
</commit_message>
<xml_diff>
--- a/Dokumen_spesifikasi_input_2.docx
+++ b/Dokumen_spesifikasi_input_2.docx
@@ -1315,7 +1315,7 @@
                 <w:highlight w:val="yellow"/>
                 <w:rtl w:val="0"/>
               </w:rPr>
-              <w:t>Metal</w:t>
+              <w:t>Aluminum alloy + Stainless steel</w:t>
             </w:r>
           </w:p>
           <w:p>
@@ -1325,7 +1325,7 @@
                 <w:color w:val="595959"/>
                 <w:sz w:val="16"/>
               </w:rPr>
-              <w:t>Catatan: Sesuai Parameter spesifikasi EMC_lengkap.docx; jenis/grade logam spesifik belum ditentukan. PVC dihindari untuk seluruh housing/bracket sesuai keputusan rapat 6 Agustus 2026 (dec:31)</w:t>
+              <w:t>Catatan: Dipilih sebagai material casing Node Sensor (dikonfirmasi user, 27 Agu 2026). Grade spesifik aluminium/stainless steel belum ditentukan. Referensi industri sejenis: Nanjing KELISAIKE K500/K800 (aluminum alloy + stainless steel, Exd II CT6) &amp; AIYI (316L stainless steel + die-casting aluminum, Ex d IIC T6 Gb) — lihat REFERENSI-KOMPONEN-BOM.md. PVC dihindari sesuai keputusan rapat 6 Agustus 2026 (dec:31)</w:t>
             </w:r>
           </w:p>
         </w:tc>
@@ -3148,7 +3148,7 @@
                 <w:highlight w:val="yellow"/>
                 <w:rtl w:val="0"/>
               </w:rPr>
-              <w:t>Metal</w:t>
+              <w:t>Aluminum alloy + Stainless steel</w:t>
             </w:r>
           </w:p>
           <w:p>
@@ -3158,7 +3158,7 @@
                 <w:color w:val="595959"/>
                 <w:sz w:val="16"/>
               </w:rPr>
-              <w:t>Catatan: Sesuai Parameter spesifikasi EMC_lengkap.docx; PVC dihindari sesuai keputusan rapat 6 Agustus 2026 (dec:31)</w:t>
+              <w:t>Catatan: Dipilih sebagai material casing Cluster Head (dikonfirmasi user, 27 Agu 2026), sama dengan Node Sensor. Grade spesifik belum ditentukan — lihat REFERENSI-KOMPONEN-BOM.md. PVC dihindari sesuai keputusan rapat 6 Agustus 2026 (dec:31)</w:t>
             </w:r>
           </w:p>
         </w:tc>
@@ -4859,7 +4859,7 @@
                 <w:highlight w:val="yellow"/>
                 <w:rtl w:val="0"/>
               </w:rPr>
-              <w:t>Metal</w:t>
+              <w:t>Aluminum alloy + Stainless steel</w:t>
             </w:r>
           </w:p>
           <w:p>
@@ -4869,7 +4869,7 @@
                 <w:color w:val="595959"/>
                 <w:sz w:val="16"/>
               </w:rPr>
-              <w:t>Catatan: Housing sama dengan Cluster Head, sesuai Parameter spesifikasi EMC_lengkap.docx</w:t>
+              <w:t>Catatan: Dipilih sebagai material casing Gateway (dikonfirmasi user, 27 Agu 2026), sama dengan Node Sensor &amp; Cluster Head. Housing fisik sama dengan Cluster Head (sesuai Parameter spesifikasi EMC_lengkap.docx). Grade spesifik belum ditentukan — lihat REFERENSI-KOMPONEN-BOM.md</w:t>
             </w:r>
           </w:p>
         </w:tc>

</xml_diff>